<commit_message>
Eng Sof Exercs ...
</commit_message>
<xml_diff>
--- a/01 Classes/Modelo Projeto de Sistemas de Informação.docx
+++ b/01 Classes/Modelo Projeto de Sistemas de Informação.docx
@@ -197,6 +197,14 @@
           <w:sz w:val="24"/>
           <w:szCs w:val="24"/>
         </w:rPr>
+        <w:t xml:space="preserve">Processos / </w:t>
+      </w:r>
+      <w:r>
+        <w:rPr>
+          <w:rFonts w:ascii="Times New Roman" w:hAnsi="Times New Roman" w:cs="Times New Roman"/>
+          <w:sz w:val="24"/>
+          <w:szCs w:val="24"/>
+        </w:rPr>
         <w:t>Rotinas e Procedimentos</w:t>
       </w:r>
     </w:p>
@@ -459,7 +467,15 @@
           <w:sz w:val="24"/>
           <w:szCs w:val="24"/>
         </w:rPr>
-        <w:t>Especificação de Processos</w:t>
+        <w:t>Especificação de Pro</w:t>
+      </w:r>
+      <w:r>
+        <w:rPr>
+          <w:rFonts w:ascii="Times New Roman" w:hAnsi="Times New Roman" w:cs="Times New Roman"/>
+          <w:sz w:val="24"/>
+          <w:szCs w:val="24"/>
+        </w:rPr>
+        <w:t>gramas</w:t>
       </w:r>
     </w:p>
     <w:p>
@@ -1168,6 +1184,7 @@
     </w:p>
     <w:p>
       <w:pPr>
+        <w:spacing w:after="60" w:line="240" w:lineRule="auto"/>
         <w:rPr>
           <w:rFonts w:ascii="Times New Roman" w:hAnsi="Times New Roman" w:cs="Times New Roman"/>
           <w:sz w:val="20"/>
@@ -1289,6 +1306,7 @@
     </w:p>
     <w:p>
       <w:pPr>
+        <w:spacing w:after="60" w:line="240" w:lineRule="auto"/>
         <w:rPr>
           <w:rFonts w:ascii="Times New Roman" w:hAnsi="Times New Roman" w:cs="Times New Roman"/>
           <w:sz w:val="20"/>
@@ -1308,6 +1326,16 @@
       <w:r>
         <w:rPr>
           <w:rFonts w:ascii="Times New Roman" w:hAnsi="Times New Roman" w:cs="Times New Roman"/>
+          <w:b/>
+          <w:bCs/>
+          <w:sz w:val="20"/>
+          <w:szCs w:val="20"/>
+        </w:rPr>
+        <w:t xml:space="preserve"> Modelagem</w:t>
+      </w:r>
+      <w:r>
+        <w:rPr>
+          <w:rFonts w:ascii="Times New Roman" w:hAnsi="Times New Roman" w:cs="Times New Roman"/>
           <w:sz w:val="20"/>
           <w:szCs w:val="20"/>
         </w:rPr>
@@ -1327,19 +1355,29 @@
       <w:r>
         <w:rPr>
           <w:rFonts w:ascii="Times New Roman" w:hAnsi="Times New Roman" w:cs="Times New Roman"/>
+          <w:sz w:val="20"/>
+          <w:szCs w:val="20"/>
+        </w:rPr>
+        <w:t xml:space="preserve">= Entidade; </w:t>
+      </w:r>
+      <w:r>
+        <w:rPr>
+          <w:rFonts w:ascii="Times New Roman" w:hAnsi="Times New Roman" w:cs="Times New Roman"/>
+          <w:b/>
+          <w:bCs/>
           <w:color w:val="EE0000"/>
           <w:sz w:val="20"/>
           <w:szCs w:val="20"/>
         </w:rPr>
-        <w:t xml:space="preserve"> </w:t>
-      </w:r>
-      <w:r>
-        <w:rPr>
-          <w:rFonts w:ascii="Times New Roman" w:hAnsi="Times New Roman" w:cs="Times New Roman"/>
-          <w:sz w:val="20"/>
-          <w:szCs w:val="20"/>
-        </w:rPr>
-        <w:t xml:space="preserve">= Entidade; </w:t>
+        <w:t>Elipse</w:t>
+      </w:r>
+      <w:r>
+        <w:rPr>
+          <w:rFonts w:ascii="Times New Roman" w:hAnsi="Times New Roman" w:cs="Times New Roman"/>
+          <w:sz w:val="20"/>
+          <w:szCs w:val="20"/>
+        </w:rPr>
+        <w:t xml:space="preserve">= Atributo; </w:t>
       </w:r>
       <w:r>
         <w:rPr>
@@ -1350,25 +1388,6 @@
           <w:sz w:val="20"/>
           <w:szCs w:val="20"/>
         </w:rPr>
-        <w:t>Elipse</w:t>
-      </w:r>
-      <w:r>
-        <w:rPr>
-          <w:rFonts w:ascii="Times New Roman" w:hAnsi="Times New Roman" w:cs="Times New Roman"/>
-          <w:sz w:val="20"/>
-          <w:szCs w:val="20"/>
-        </w:rPr>
-        <w:t xml:space="preserve"> = Atributo; </w:t>
-      </w:r>
-      <w:r>
-        <w:rPr>
-          <w:rFonts w:ascii="Times New Roman" w:hAnsi="Times New Roman" w:cs="Times New Roman"/>
-          <w:b/>
-          <w:bCs/>
-          <w:color w:val="EE0000"/>
-          <w:sz w:val="20"/>
-          <w:szCs w:val="20"/>
-        </w:rPr>
         <w:t>Losango</w:t>
       </w:r>
       <w:r>
@@ -1377,7 +1396,7 @@
           <w:sz w:val="20"/>
           <w:szCs w:val="20"/>
         </w:rPr>
-        <w:t xml:space="preserve"> = Relacionamento</w:t>
+        <w:t>= Relacionamento</w:t>
       </w:r>
     </w:p>
     <w:p>
@@ -1385,6 +1404,7 @@
         <w:tabs>
           <w:tab w:val="left" w:pos="4995"/>
         </w:tabs>
+        <w:spacing w:after="60" w:line="240" w:lineRule="auto"/>
         <w:rPr>
           <w:rFonts w:ascii="Times New Roman" w:hAnsi="Times New Roman" w:cs="Times New Roman"/>
           <w:sz w:val="20"/>
@@ -1428,15 +1448,59 @@
           <w:sz w:val="20"/>
           <w:szCs w:val="20"/>
         </w:rPr>
-        <w:t>DER</w:t>
-      </w:r>
-      <w:r>
-        <w:rPr>
-          <w:rFonts w:ascii="Times New Roman" w:hAnsi="Times New Roman" w:cs="Times New Roman"/>
+        <w:t xml:space="preserve">Tool Case </w:t>
+      </w:r>
+      <w:r>
+        <w:rPr>
+          <w:rFonts w:ascii="Times New Roman" w:hAnsi="Times New Roman" w:cs="Times New Roman"/>
+          <w:b/>
+          <w:bCs/>
           <w:color w:val="EE0000"/>
           <w:sz w:val="20"/>
           <w:szCs w:val="20"/>
         </w:rPr>
+        <w:t>MER/</w:t>
+      </w:r>
+      <w:r>
+        <w:rPr>
+          <w:rFonts w:ascii="Times New Roman" w:hAnsi="Times New Roman" w:cs="Times New Roman"/>
+          <w:b/>
+          <w:bCs/>
+          <w:color w:val="EE0000"/>
+          <w:sz w:val="20"/>
+          <w:szCs w:val="20"/>
+        </w:rPr>
+        <w:t>D</w:t>
+      </w:r>
+      <w:r>
+        <w:rPr>
+          <w:rFonts w:ascii="Times New Roman" w:hAnsi="Times New Roman" w:cs="Times New Roman"/>
+          <w:b/>
+          <w:bCs/>
+          <w:color w:val="EE0000"/>
+          <w:sz w:val="20"/>
+          <w:szCs w:val="20"/>
+        </w:rPr>
+        <w:t>ER</w:t>
+      </w:r>
+      <w:r>
+        <w:rPr>
+          <w:rFonts w:ascii="Times New Roman" w:hAnsi="Times New Roman" w:cs="Times New Roman"/>
+          <w:b/>
+          <w:bCs/>
+          <w:color w:val="EE0000"/>
+          <w:sz w:val="20"/>
+          <w:szCs w:val="20"/>
+        </w:rPr>
+        <w:t>/DDL</w:t>
+      </w:r>
+      <w:r>
+        <w:rPr>
+          <w:rFonts w:ascii="Times New Roman" w:hAnsi="Times New Roman" w:cs="Times New Roman"/>
+          <w:color w:val="EE0000"/>
+          <w:sz w:val="20"/>
+          <w:szCs w:val="20"/>
+        </w:rPr>
         <w:t xml:space="preserve"> </w:t>
       </w:r>
       <w:r>
@@ -1446,6 +1510,94 @@
           <w:szCs w:val="20"/>
         </w:rPr>
         <w:t>= Modelar o BD</w:t>
+      </w:r>
+    </w:p>
+    <w:p>
+      <w:pPr>
+        <w:tabs>
+          <w:tab w:val="left" w:pos="4995"/>
+        </w:tabs>
+        <w:spacing w:after="60" w:line="240" w:lineRule="auto"/>
+        <w:rPr>
+          <w:rFonts w:ascii="Times New Roman" w:hAnsi="Times New Roman" w:cs="Times New Roman"/>
+          <w:sz w:val="20"/>
+          <w:szCs w:val="20"/>
+        </w:rPr>
+      </w:pPr>
+      <w:r>
+        <w:rPr>
+          <w:rFonts w:ascii="Times New Roman" w:hAnsi="Times New Roman" w:cs="Times New Roman"/>
+          <w:b/>
+          <w:bCs/>
+          <w:sz w:val="20"/>
+          <w:szCs w:val="20"/>
+        </w:rPr>
+        <w:t>Precificação</w:t>
+      </w:r>
+      <w:r>
+        <w:rPr>
+          <w:rFonts w:ascii="Times New Roman" w:hAnsi="Times New Roman" w:cs="Times New Roman"/>
+          <w:sz w:val="20"/>
+          <w:szCs w:val="20"/>
+        </w:rPr>
+        <w:t xml:space="preserve"> </w:t>
+      </w:r>
+      <w:proofErr w:type="gramStart"/>
+      <w:r>
+        <w:rPr>
+          <w:rFonts w:ascii="Times New Roman" w:hAnsi="Times New Roman" w:cs="Times New Roman"/>
+          <w:b/>
+          <w:bCs/>
+          <w:color w:val="EE0000"/>
+          <w:sz w:val="20"/>
+          <w:szCs w:val="20"/>
+        </w:rPr>
+        <w:t>UST</w:t>
+      </w:r>
+      <w:r>
+        <w:rPr>
+          <w:rFonts w:ascii="Times New Roman" w:hAnsi="Times New Roman" w:cs="Times New Roman"/>
+          <w:sz w:val="20"/>
+          <w:szCs w:val="20"/>
+        </w:rPr>
+        <w:t>(</w:t>
+      </w:r>
+      <w:proofErr w:type="gramEnd"/>
+      <w:r>
+        <w:rPr>
+          <w:rFonts w:ascii="Times New Roman" w:hAnsi="Times New Roman" w:cs="Times New Roman"/>
+          <w:sz w:val="20"/>
+          <w:szCs w:val="20"/>
+        </w:rPr>
+        <w:t xml:space="preserve">Unidade de Serviço Técnico) = CF; CV; Impostos / Lucro; R$160,00 </w:t>
+      </w:r>
+      <w:proofErr w:type="spellStart"/>
+      <w:r>
+        <w:rPr>
+          <w:rFonts w:ascii="Times New Roman" w:hAnsi="Times New Roman" w:cs="Times New Roman"/>
+          <w:b/>
+          <w:bCs/>
+          <w:sz w:val="20"/>
+          <w:szCs w:val="20"/>
+        </w:rPr>
+        <w:t>senior</w:t>
+      </w:r>
+      <w:proofErr w:type="spellEnd"/>
+      <w:r>
+        <w:rPr>
+          <w:rFonts w:ascii="Times New Roman" w:hAnsi="Times New Roman" w:cs="Times New Roman"/>
+          <w:sz w:val="20"/>
+          <w:szCs w:val="20"/>
+        </w:rPr>
+        <w:t>/</w:t>
+      </w:r>
+      <w:r>
+        <w:rPr>
+          <w:rFonts w:ascii="Times New Roman" w:hAnsi="Times New Roman" w:cs="Times New Roman"/>
+          <w:sz w:val="20"/>
+          <w:szCs w:val="20"/>
+        </w:rPr>
+        <w:t>pleno</w:t>
       </w:r>
       <w:r>
         <w:rPr>

</xml_diff>